<commit_message>
M16: regenerate hollowell-ip under the wave's knobs (baseline + mail demonstrator)
Wholesale regen through the live airlock (claude-opus-4-8[1m], xhigh).
Baseline realism (business_calendar: weekend meetings 0/0, book_is_sample,
style_specs: 10 specs, voice_diversify) plus the fleet's first real mail
threads: engagement mail runs as In-Reply-To chains (eml raised 3->18 above
the 5 engagements), 4 mundane internal emails with exempt_author_mentions,
1 distribution list. Client-facing replies authored in a client register;
mundane authors no longer self-name (criterion 7 proof bed, board to
confirm). Validates clean (29 rules, EML/DL run, 0 errors); self-scores
100%; byte-pin re-derives; org-tier green.
</commit_message>
<xml_diff>
--- a/companies/hollowell-ip/Engagements/Jackson Inc/2024.04.12 - Kickoff Memo - Trademark Clearance.docx
+++ b/companies/hollowell-ip/Engagements/Jackson Inc/2024.04.12 - Kickoff Memo - Trademark Clearance.docx
@@ -3,11 +3,30 @@
 <w:document xmlns:wpc="http://schemas.microsoft.com/office/word/2010/wordprocessingCanvas" xmlns:mo="http://schemas.microsoft.com/office/mac/office/2008/main" xmlns:mc="http://schemas.openxmlformats.org/markup-compatibility/2006" xmlns:mv="urn:schemas-microsoft-com:mac:vml" xmlns:o="urn:schemas-microsoft-com:office:office" xmlns:r="http://schemas.openxmlformats.org/officeDocument/2006/relationships" xmlns:m="http://schemas.openxmlformats.org/officeDocument/2006/math" xmlns:v="urn:schemas-microsoft-com:vml" xmlns:wp14="http://schemas.microsoft.com/office/word/2010/wordprocessingDrawing" xmlns:wp="http://schemas.openxmlformats.org/drawingml/2006/wordprocessingDrawing" xmlns:w10="urn:schemas-microsoft-com:office:word" xmlns:w="http://schemas.openxmlformats.org/wordprocessingml/2006/main" xmlns:w14="http://schemas.microsoft.com/office/word/2010/wordml" xmlns:wpg="http://schemas.microsoft.com/office/word/2010/wordprocessingGroup" xmlns:wpi="http://schemas.microsoft.com/office/word/2010/wordprocessingInk" xmlns:wne="http://schemas.microsoft.com/office/word/2006/wordml" xmlns:wps="http://schemas.microsoft.com/office/word/2010/wordprocessingShape" mc:Ignorable="w14 wp14">
   <w:body>
     <w:p>
+      <w:r>
+        <w:t>To: Kelly Snyder, Matthew Parrish</w:t>
+        <w:br/>
+        <w:t>From: Ashley Williams</w:t>
+        <w:br/>
+        <w:t>Re: Kickoff -- Trademark Clearance for Jackson Inc</w:t>
+      </w:r>
+    </w:p>
+    <w:p>
+      <w:r>
+        <w:t>Our job on this one is narrow, and I want us to hold it that way. Jackson Inc has given us a set of proposed marks to clear before it commits to any of them, and the Jackson Inc engagement opened on April 9, 2024. We owe the client a clean search of each candidate and a written assessment of the risk it carries, and nothing that reads as a conclusion on that risk goes out without counsel's review.</w:t>
+      </w:r>
+    </w:p>
+    <w:p>
+      <w:r>
+        <w:t>We are at the very front of the work, so this memo sets the scope and the order of the searches, not any findings. There are no results yet, and there should not be. Read it as the plan of record for the matter, and tell me now if any of it does not fit how you expected the clearance to run.</w:t>
+      </w:r>
+    </w:p>
+    <w:p>
       <w:pPr>
-        <w:pStyle w:val="ListBullet"/>
+        <w:pStyle w:val="Heading2"/>
       </w:pPr>
       <w:r>
-        <w:t>To: Kelly Snyder, Associate; Matthew Parrish, Patent Agent</w:t>
+        <w:t>How the work breaks down, in the order I expect us to run it</w:t>
       </w:r>
     </w:p>
     <w:p>
@@ -15,7 +34,7 @@
         <w:pStyle w:val="ListBullet"/>
       </w:pPr>
       <w:r>
-        <w:t>From: Ashley Williams, Patent Agent</w:t>
+        <w:t>Fix the scope. I will pin down each candidate mark and the exact goods and services Jackson Inc means to use it on, from what Cynthia Hunter and her team send over. A mark cleared against the wrong class is not cleared at all, so this comes first and I will not rush it.</w:t>
       </w:r>
     </w:p>
     <w:p>
@@ -23,25 +42,7 @@
         <w:pStyle w:val="ListBullet"/>
       </w:pPr>
       <w:r>
-        <w:t>Re: Trademark clearance engagement for Jackson Inc, kickoff and workstreams</w:t>
-      </w:r>
-    </w:p>
-    <w:p>
-      <w:r>
-        <w:t>The engagement opens on April 9, 2024 and this memorandum sets out how we will run it. The objective is a defensible clearance record for the candidate marks Jackson Inc has proposed, delivered in a form that will still make sense to a reader some years from now who was not party to any conversation we have about it. That reader is the audience for everything in this file. What we searched, what we did not search, and why we drew the boundary where we did belongs in the record at the time we do the work, not reconstructed from memory afterward.</w:t>
-      </w:r>
-    </w:p>
-    <w:p>
-      <w:r>
-        <w:t>We are at the front of the matter. Nothing in the file yet constitutes an opinion and nothing leaves this office described as one, in an email or otherwise. Cynthia Hunter is the client contact. Substantive correspondence goes to her, against the docket number, and into the file the same day it is sent.</w:t>
-      </w:r>
-    </w:p>
-    <w:p>
-      <w:pPr>
-        <w:pStyle w:val="Heading2"/>
-      </w:pPr>
-      <w:r>
-        <w:t>Workstreams</w:t>
+        <w:t>Knockout searches. I will run a first-pass search of each candidate against the federal register, to drop any that collide head-on before we spend the full search on it. This is a filter, not an opinion, and it stays that way in the file.</w:t>
       </w:r>
     </w:p>
     <w:p>
@@ -49,7 +50,7 @@
         <w:pStyle w:val="ListBullet"/>
       </w:pPr>
       <w:r>
-        <w:t>Knockout screening. I will run the initial screen against federal registrations and pending applications and produce a short report identifying which candidates do not survive it. A candidate that fails the screen is documented with the reference that stopped it. We do not simply drop it off the list; a mark that disappears without a record is a mark somebody proposes again in six months.</w:t>
+        <w:t>Full clearance search. For the marks that survive the knockout, I will search the federal register, the state registries, and the common-law sources, and pull every mark that reads as the same or confusingly similar. Matthew Parrish will take the state and common-law searches so we cover more ground in parallel rather than one source after another.</w:t>
       </w:r>
     </w:p>
     <w:p>
@@ -57,81 +58,22 @@
         <w:pStyle w:val="ListBullet"/>
       </w:pPr>
       <w:r>
-        <w:t>Full clearance searching. Kelly Snyder will scope the vendor searches for the surviving candidates and reconcile the returns against the state and common-law sources. Organize the results by mark rather than by source. Each mark gets its own record and keeps it through the opinion.</w:t>
-      </w:r>
-    </w:p>
-    <w:p>
-      <w:pPr>
-        <w:pStyle w:val="ListBullet"/>
-      </w:pPr>
-      <w:r>
-        <w:t>Search boundaries and prior use. Matthew Parrish will define the limits of the search and draft the section stating what was and was not examined. That section is the part of an opinion most likely to be read by someone looking for a gap, and it will be written as though it already has been.</w:t>
-      </w:r>
-    </w:p>
-    <w:p>
-      <w:pPr>
-        <w:pStyle w:val="ListBullet"/>
-      </w:pPr>
-      <w:r>
-        <w:t>Opinions. I will draft. Kelly Snyder will review the record behind each conclusion before it goes out, and Matthew Parrish will confirm that no sentence in the analysis reaches past the boundary section into territory the search did not cover.</w:t>
-      </w:r>
-    </w:p>
-    <w:p>
-      <w:pPr>
-        <w:pStyle w:val="ListBullet"/>
-      </w:pPr>
-      <w:r>
-        <w:t>Docketing. Kelly Snyder holds the docket for this matter. Any date any of us learns goes to her the day we learn it, including dates that arrive by telephone from the client. Especially those.</w:t>
-      </w:r>
-    </w:p>
-    <w:p>
-      <w:pPr>
-        <w:pStyle w:val="Heading2"/>
-      </w:pPr>
-      <w:r>
-        <w:t>Next Steps</w:t>
-      </w:r>
-    </w:p>
-    <w:p>
-      <w:pPr>
-        <w:pStyle w:val="ListBullet"/>
-      </w:pPr>
-      <w:r>
-        <w:t>Confirm the candidate list in writing with the client before any search is ordered. I am not willing to search a mark that was withdrawn in a meeting nobody memorialized, or to omit one that was added in the same meeting.</w:t>
-      </w:r>
-    </w:p>
-    <w:p>
-      <w:pPr>
-        <w:pStyle w:val="ListBullet"/>
-      </w:pPr>
-      <w:r>
-        <w:t>Confirm the intended description of goods in the same writing. Clearance is bound to the categories we search. An opinion written against one description does not travel to another, and the time to establish the description is now rather than at the draft.</w:t>
-      </w:r>
-    </w:p>
-    <w:p>
-      <w:pPr>
-        <w:pStyle w:val="ListBullet"/>
-      </w:pPr>
-      <w:r>
-        <w:t>Circulate the search parameters to the group for comment before the vendor order goes out. Comments in advance are cheap. A parameter we should have caught becomes a boundary problem in the opinion.</w:t>
-      </w:r>
-    </w:p>
-    <w:p>
-      <w:pPr>
-        <w:pStyle w:val="ListBullet"/>
-      </w:pPr>
-      <w:r>
-        <w:t>A short standing note each week: what moved, what is waiting, what is at risk. Two paragraphs is sufficient. Silence is not.</w:t>
+        <w:t>Record and report. Kelly Snyder keeps the search record current and anchored to the docket as we go, and she will build the written clearance report from it. The risk assessment in that report is reviewed by counsel before it reaches the client, not sent straight from the search results.</w:t>
       </w:r>
     </w:p>
     <w:p>
       <w:r>
-        <w:t>One matter of drafting practice, since we have a new file and it is easier to set the habit now than to correct it in the opinions. Write internal notes in the register you would use for a document that is filed. I do not maintain two registers, and I would rather not read one. A note written loosely because it was only for us has a way of becoming the exhibit that explains what we thought at the time.</w:t>
+        <w:t>One rule while the matter is open. Anything that goes to Jackson Inc that touches a conclusion on risk goes through counsel first. We are agents on this clearance, and the view on whether a mark is safe to adopt is the firm's to give and to stand behind, so we hand it up rather than offer it ourselves. Routine questions about scope and materials I will take with Cynthia Hunter directly, and I will copy the two of you so the thread stays in one place.</w:t>
       </w:r>
     </w:p>
     <w:p>
       <w:r>
-        <w:t>The engagement runs roughly four months. That is enough time to do this properly and not enough to do it twice. Raise anything that looks like a scope or boundary question early. A question about scope is inexpensive this week and expensive in a draft opinion.</w:t>
+        <w:t>Getting started this week: I will send Cynthia Hunter the short list of what we need to fix the scope, and Kelly Snyder will open the matter on the docket and stand up the search file. Matthew Parrish, start reading into the goods-and-services classes for the candidates so we are ready to search the moment the scope is set.</w:t>
+      </w:r>
+    </w:p>
+    <w:p>
+      <w:r>
+        <w:t>The first thing that has to happen is the scope. Nothing downstream is worth starting until each candidate mark and its classes are fixed in writing, so that is where our time goes now.</w:t>
       </w:r>
     </w:p>
     <w:sectPr>

</xml_diff>